<commit_message>
docs: reframe proposal docx/pdf as volunteer research
Co-Authored-By: Claude Opus 5.5 (1M context) <noreply@anthropic.com>
</commit_message>
<xml_diff>
--- a/docs/pre-projeto-bioacustica-inpe.docx
+++ b/docs/pre-projeto-bioacustica-inpe.docx
@@ -15,12 +15,12 @@
         <w:pStyle w:val="Subtitle"/>
       </w:pPr>
       <w:r>
-        <w:t>Pré projeto de mestrado em Sensoriamento Remoto</w:t>
+        <w:t>Projeto de pesquisa independente e voluntário em ciência aberta</w:t>
       </w:r>
     </w:p>
     <w:p>
       <w:r>
-        <w:t>Proponente Paulo  |  Programa pretendido INPE  |  2 de outubro de 2026</w:t>
+        <w:t>Proponente Paulo  |  Dados públicos do INPE  |  2 de outubro de 2026</w:t>
       </w:r>
     </w:p>
     <w:p>
@@ -2173,7 +2173,7 @@
                 <w:b w:val="0"/>
                 <w:sz w:val="20"/>
               </w:rPr>
-              <w:t>Dissertação, artigo e disponibilização dos materiais permitidos.</w:t>
+              <w:t>Relatório técnico, artigo e disponibilização dos materiais permitidos.</w:t>
             </w:r>
           </w:p>
         </w:tc>
@@ -2212,7 +2212,7 @@
     </w:p>
     <w:p>
       <w:r>
-        <w:t>A orientação precisa cobrir sensoriamento remoto e análise temporal. Uma parceria ou coorientação em ecologia de aves apoiará amostragem, referência florestal e validação taxonômica. A proposta será ajustada às exigências vigentes do programa e do edital antes de submissão.</w:t>
+        <w:t>A equipe precisa cobrir sensoriamento remoto e análise temporal. A colaboração voluntária de um pesquisador ou grupo de ecologia de aves apoiará amostragem, referência florestal e validação taxonômica. Equipamentos e custos de campo dependerão de empréstimos, parcerias ou pequenos financiamentos.</w:t>
       </w:r>
     </w:p>
     <w:p>
@@ -2243,7 +2243,7 @@
     </w:p>
     <w:p>
       <w:r>
-        <w:t>As entregas serão uma dissertação, um manuscrito e um fluxo de processamento reproduzível. O fluxo registrará versões das coleções, datas de acesso, parâmetros de qualidade, identificadores de itens STAC e decisões de anotação. A base final terá tabelas de áreas, gravações, detecções, campanhas e variáveis ópticas, com chaves explícitas e um dicionário de dados.</w:t>
+        <w:t>As entregas serão um relatório técnico público, um manuscrito e um fluxo de processamento reproduzível. O fluxo registrará versões das coleções, datas de acesso, parâmetros de qualidade, identificadores de itens STAC e decisões de anotação. A base final terá tabelas de áreas, gravações, detecções, campanhas e variáveis ópticas, com chaves explícitas e um dicionário de dados.</w:t>
       </w:r>
     </w:p>
     <w:p>
@@ -2354,7 +2354,7 @@
     </w:p>
     <w:p>
       <w:r>
-        <w:t>Fontes consultadas em 2 de outubro de 2026. O título, a área amostral e a base definitiva serão consolidados após a auditoria dos metadados e a discussão com a orientação.</w:t>
+        <w:t>Fontes consultadas em 2 de outubro de 2026. O título, a área amostral e a base definitiva serão consolidados após a auditoria dos metadados e a discussão com os colaboradores.</w:t>
       </w:r>
     </w:p>
     <w:sectPr>

</xml_diff>